<commit_message>
Made changes to SRS file
</commit_message>
<xml_diff>
--- a/docs/BTech_3rd_Year_SRS_Divyansh_Yadav.docx
+++ b/docs/BTech_3rd_Year_SRS_Divyansh_Yadav.docx
@@ -657,7 +657,7 @@
                 <w:color w:val="2B2D42"/>
                 <w:sz w:val="18"/>
               </w:rPr>
-              <w:t>Production Sarcasm Engine Upgrade (cardiffnlp/twitter-roberta-base-irony), Affective Purity Guards, Contextual Incongruity Calibration &amp; Production Empirical Validation (Macro-F1 0.913, Sarcasm F1 0.900, 24/24 Automated Tests Passing)</w:t>
+              <w:t>Production Sarcasm Engine Upgrade (cardiffnlp/twitter-roberta-base-irony), Affective Purity Guards, Contextual Incongruity Calibration &amp; Production Empirical Validation (Macro-F1 0.913, Sarcasm F1 0.900, 26 Automated Tests Passing)</w:t>
             </w:r>
           </w:p>
         </w:tc>
@@ -872,7 +872,7 @@
           <w:color w:val="2B2D42"/>
           <w:sz w:val="20"/>
         </w:rPr>
-        <w:t>Expected Benefits: Sub-70ms warm CPU inference latency (mean 47.5–68.2 ms); empirical multi-class Emotion Macro-F1 of 0.913 (91.4% accuracy) and Sarcasm F1 of 0.900; 100% test coverage with 24/24 automated unit tests passing; zero false-positive sarcasm on genuine joy; guarantees 100% frontend-to-backend audit parity; eliminates generative LLM label hallucination; improves text triage accuracy in customer experience (CX) and conversational AI moderation; and runs completely on standard consumer hardware (8 GB RAM laptop) without paid cloud infrastructure.</w:t>
+        <w:t>Expected Benefits: Local CPU execution with a cold start under 1.2 s and a warm mean end-to-end pipeline latency of about 4.1 s (dominated by CPU transformer inference; the deterministic machine-only scoring path, excluding the optional LLM rationale, runs in tens of milliseconds); empirical multi-class Emotion Macro-F1 of 0.913 (91.4% accuracy) and Sarcasm F1 of 0.900; an automated pytest suite of 26 tests passing; zero false-positive sarcasm on genuine joy; guarantees 100% frontend-to-backend audit parity; eliminates generative LLM label hallucination; improves text triage accuracy in customer experience (CX) and conversational AI moderation; and runs completely on standard consumer hardware (8 GB RAM laptop) without paid cloud infrastructure.</w:t>
       </w:r>
     </w:p>
     <w:p>
@@ -1794,7 +1794,7 @@
                 <w:color w:val="2B2D42"/>
                 <w:sz w:val="18"/>
               </w:rPr>
-              <w:t>Threshold filter suppressing spurious sarcasm triggers on high-valence genuine positive expressions (Joy confidence &gt; 0.65).</w:t>
+              <w:t>Threshold filter suppressing spurious sarcasm triggers on high-valence genuine positive expressions (Joy confidence &gt; 0.70).</w:t>
             </w:r>
           </w:p>
         </w:tc>
@@ -2343,7 +2343,7 @@
                 <w:color w:val="2B2D42"/>
                 <w:sz w:val="18"/>
               </w:rPr>
-              <w:t>Uploads batch CSV files, reviews aggregate sentiment distributions, identifies sarcastic customer escalations, and exports reports.</w:t>
+              <w:t>Uploads batch CSV files and reviews aggregate sentiment distributions to identify sarcastic customer escalations (CSV result export is a planned enhancement).</w:t>
             </w:r>
           </w:p>
         </w:tc>
@@ -2487,7 +2487,7 @@
           <w:color w:val="2B2D42"/>
           <w:sz w:val="20"/>
         </w:rPr>
-        <w:t>Server Runtime Environment: Standard consumer laptop or workstation running Windows 10/11 or Ubuntu Linux 22.04 LTS; Python 3.11 runtime; Flask 3.0; PyTorch 2.4 (CPU build); Transformers 4.44; Sentence-Transformers 3.0.</w:t>
+        <w:t>Server Runtime Environment: Standard consumer laptop or workstation running Windows 10/11 or Ubuntu Linux 22.04 LTS; Python 3.11 runtime; Flask 3.0; PyTorch 2.14 (CPU build); Transformers 5.18; Sentence-Transformers 6.1.</w:t>
       </w:r>
     </w:p>
     <w:p>
@@ -4754,7 +4754,7 @@
                 <w:color w:val="2B2D42"/>
                 <w:sz w:val="18"/>
               </w:rPr>
-              <w:t>Mean warm CPU inference latency &lt; 150 ms (empirically measured at 47.5–68.2 ms, cold start &lt; 1.2s); multi-class Emotion Macro-F1 &gt;= 0.85 (achieved 0.913 across 7 classes); Sarcasm F1 &gt;= 0.85 (achieved 0.900); web dashboard page load &lt; 1.0s under standard concurrency; 24/24 automated unit/regression tests passing in 5.4s.</w:t>
+              <w:t>Achieved on a 35-case held-out evaluation set: Emotion Macro-F1 0.913 (91.4% accuracy) and Sarcasm F1 0.900. Targets: Emotion Macro-F1 &gt;= 0.70 and Sarcasm F1 &gt;= 0.65. Cold-start latency &lt; 1.2s; warm CPU inference fully within the 8 GB RAM budget. Automated pytest suite: 26 tests passing (offline, models disabled).</w:t>
             </w:r>
           </w:p>
         </w:tc>
@@ -4869,7 +4869,7 @@
                 <w:color w:val="2B2D42"/>
                 <w:sz w:val="18"/>
               </w:rPr>
-              <w:t>Unit security red-team test suite (tests/test_security.py); static code analysis; git-leak scanning.</w:t>
+              <w:t>Unit security red-team test suite (tests/test_redteam.py); static code analysis and manual review; prompt-injection test cases.</w:t>
             </w:r>
           </w:p>
         </w:tc>
@@ -4957,7 +4957,7 @@
                 <w:color w:val="2B2D42"/>
                 <w:sz w:val="18"/>
               </w:rPr>
-              <w:t>Simulated network disconnect tests; mock LLM mode unit tests (tests/test_engines.py); database rollback verification.</w:t>
+              <w:t>Simulated network disconnect tests; LLM mock-mode unit tests (pytest suite in tests/); database rollback verification.</w:t>
             </w:r>
           </w:p>
         </w:tc>
@@ -5684,7 +5684,7 @@
           <w:color w:val="4B6B94"/>
           <w:sz w:val="20"/>
         </w:rPr>
-        <w:t>Figure 6.3: Production Empirical Evaluation Benchmarks — Confusion Matrix &amp; Latency Distribution</w:t>
+        <w:t>Figure 6.3: Empirical Evaluation Benchmarks — Emotion &amp; Sarcasm Metrics with Latency Distribution</w:t>
       </w:r>
     </w:p>
     <w:p>
@@ -5740,7 +5740,7 @@
           <w:color w:val="7A8290"/>
           <w:sz w:val="17"/>
         </w:rPr>
-        <w:t>Figure 6.3 displays the empirical validation results on the production evaluation suite: achieving 0.913 Macro-F1 across all 7 emotion classes, 0.900 F1 on Sarcasm/Irony, and sub-70ms warm CPU inference latency distribution (mean 47.5–68.2 ms).</w:t>
+        <w:t>Figure 6.3 displays the empirical validation results on a 35-case held-out evaluation set: 0.913 Macro-F1 across all 7 emotion classes, 0.900 F1 on Sarcasm/Irony, and the warm CPU inference latency distribution.</w:t>
       </w:r>
     </w:p>
     <w:p>

</xml_diff>